<commit_message>
Changes in Minutes of meeting
</commit_message>
<xml_diff>
--- a/Docs/meeting_notes/Meeting Record_05082026.docx
+++ b/Docs/meeting_notes/Meeting Record_05082026.docx
@@ -95,16 +95,44 @@
           <w:rFonts w:eastAsia="Times"/>
         </w:rPr>
         <w:tab/>
-        <w:t xml:space="preserve">Shreyash </w:t>
-      </w:r>
-      <w:proofErr w:type="spellStart"/>
-      <w:r>
-        <w:rPr>
-          <w:rFonts w:eastAsia="Times"/>
-        </w:rPr>
-        <w:t>Narayane</w:t>
-      </w:r>
-      <w:proofErr w:type="spellEnd"/>
+        <w:t>Shreyash Narayane (</w:t>
+      </w:r>
+      <w:r>
+        <w:rPr>
+          <w:rFonts w:eastAsia="Times"/>
+        </w:rPr>
+        <w:t>25934391</w:t>
+      </w:r>
+      <w:r>
+        <w:rPr>
+          <w:rFonts w:eastAsia="Times"/>
+        </w:rPr>
+        <w:t>)</w:t>
+      </w:r>
+      <w:r>
+        <w:rPr>
+          <w:rFonts w:eastAsia="Times"/>
+        </w:rPr>
+        <w:br/>
+      </w:r>
+      <w:r>
+        <w:rPr>
+          <w:rFonts w:eastAsia="Times"/>
+        </w:rPr>
+        <w:tab/>
+      </w:r>
+      <w:r>
+        <w:rPr>
+          <w:rFonts w:eastAsia="Times"/>
+        </w:rPr>
+        <w:tab/>
+      </w:r>
+      <w:r>
+        <w:rPr>
+          <w:rFonts w:eastAsia="Times"/>
+        </w:rPr>
+        <w:t>Rohan Chaudhary</w:t>
+      </w:r>
       <w:r>
         <w:rPr>
           <w:rFonts w:eastAsia="Times"/>
@@ -115,7 +143,7 @@
         <w:rPr>
           <w:rFonts w:eastAsia="Times"/>
         </w:rPr>
-        <w:t>25934391</w:t>
+        <w:t>25731542</w:t>
       </w:r>
       <w:r>
         <w:rPr>
@@ -145,58 +173,8 @@
         <w:rPr>
           <w:rFonts w:eastAsia="Times"/>
         </w:rPr>
-        <w:t>Rohan Chaudhary</w:t>
-      </w:r>
-      <w:r>
-        <w:rPr>
-          <w:rFonts w:eastAsia="Times"/>
-        </w:rPr>
-        <w:t xml:space="preserve"> (</w:t>
-      </w:r>
-      <w:r>
-        <w:rPr>
-          <w:rFonts w:eastAsia="Times"/>
-        </w:rPr>
-        <w:t>25731542</w:t>
-      </w:r>
-      <w:r>
-        <w:rPr>
-          <w:rFonts w:eastAsia="Times"/>
-        </w:rPr>
-        <w:t>)</w:t>
-      </w:r>
-      <w:r>
-        <w:rPr>
-          <w:rFonts w:eastAsia="Times"/>
-        </w:rPr>
-        <w:br/>
-      </w:r>
-      <w:r>
-        <w:rPr>
-          <w:rFonts w:eastAsia="Times"/>
-        </w:rPr>
-        <w:tab/>
-      </w:r>
-      <w:r>
-        <w:rPr>
-          <w:rFonts w:eastAsia="Times"/>
-        </w:rPr>
-        <w:tab/>
-      </w:r>
-      <w:r>
-        <w:rPr>
-          <w:rFonts w:eastAsia="Times"/>
-        </w:rPr>
-        <w:t xml:space="preserve">Prathamesh </w:t>
-      </w:r>
-      <w:proofErr w:type="spellStart"/>
-      <w:r>
-        <w:rPr>
-          <w:rFonts w:eastAsia="Times"/>
-        </w:rPr>
-        <w:t>Nemade</w:t>
-      </w:r>
-      <w:proofErr w:type="spellEnd"/>
+        <w:t>Prathamesh Nemade</w:t>
+      </w:r>
       <w:r>
         <w:rPr>
           <w:rFonts w:eastAsia="Times"/>
@@ -324,28 +302,125 @@
     <w:p>
       <w:pPr>
         <w:pStyle w:val="Heading2"/>
-        <w:rPr>
-          <w:rFonts w:eastAsia="Times"/>
-        </w:rPr>
-      </w:pPr>
+        <w:numPr>
+          <w:ilvl w:val="0"/>
+          <w:numId w:val="1"/>
+        </w:numPr>
+        <w:rPr>
+          <w:rFonts w:eastAsia="Times"/>
+        </w:rPr>
+      </w:pPr>
+      <w:r>
+        <w:rPr>
+          <w:rFonts w:eastAsia="Times"/>
+        </w:rPr>
+        <w:t xml:space="preserve">Create and </w:t>
+      </w:r>
+      <w:r>
+        <w:rPr>
+          <w:rFonts w:eastAsia="Times"/>
+        </w:rPr>
+        <w:t xml:space="preserve">Setup </w:t>
+      </w:r>
+      <w:r>
+        <w:rPr>
+          <w:rFonts w:eastAsia="Times"/>
+        </w:rPr>
+        <w:t xml:space="preserve">github </w:t>
+      </w:r>
+      <w:r>
+        <w:rPr>
+          <w:rFonts w:eastAsia="Times"/>
+        </w:rPr>
+        <w:t xml:space="preserve">repository </w:t>
+      </w:r>
+      <w:r>
+        <w:rPr>
+          <w:rFonts w:eastAsia="Times"/>
+        </w:rPr>
+        <w:t xml:space="preserve">for project </w:t>
+      </w:r>
+      <w:r>
+        <w:rPr>
+          <w:rFonts w:eastAsia="Times"/>
+        </w:rPr>
+        <w:t xml:space="preserve">collaboraton </w:t>
+      </w:r>
     </w:p>
     <w:p>
       <w:pPr>
-        <w:pStyle w:val="Heading2"/>
-        <w:rPr>
-          <w:rFonts w:eastAsia="Times"/>
-        </w:rPr>
-      </w:pPr>
+        <w:pStyle w:val="ListParagraph"/>
+        <w:numPr>
+          <w:ilvl w:val="0"/>
+          <w:numId w:val="1"/>
+        </w:numPr>
+        <w:rPr>
+          <w:sz w:val="28"/>
+          <w:szCs w:val="28"/>
+        </w:rPr>
+      </w:pPr>
+      <w:r>
+        <w:rPr>
+          <w:rFonts w:ascii="Copperplate Gothic Light" w:hAnsi="Copperplate Gothic Light"/>
+          <w:sz w:val="28"/>
+          <w:szCs w:val="28"/>
+        </w:rPr>
+        <w:t xml:space="preserve">Create </w:t>
+      </w:r>
+      <w:r>
+        <w:rPr>
+          <w:rFonts w:ascii="Copperplate Gothic Light" w:hAnsi="Copperplate Gothic Light"/>
+          <w:sz w:val="28"/>
+          <w:szCs w:val="28"/>
+        </w:rPr>
+        <w:t>official communication channel using Slack</w:t>
+      </w:r>
     </w:p>
-    <w:p/>
-    <w:p/>
     <w:p>
       <w:pPr>
-        <w:pStyle w:val="Heading2"/>
-        <w:rPr>
-          <w:rFonts w:eastAsia="Times"/>
-        </w:rPr>
-      </w:pPr>
+        <w:pStyle w:val="ListParagraph"/>
+        <w:numPr>
+          <w:ilvl w:val="0"/>
+          <w:numId w:val="1"/>
+        </w:numPr>
+        <w:rPr>
+          <w:rFonts w:ascii="Copperplate Gothic Light" w:hAnsi="Copperplate Gothic Light"/>
+          <w:sz w:val="28"/>
+          <w:szCs w:val="28"/>
+        </w:rPr>
+      </w:pPr>
+      <w:r>
+        <w:rPr>
+          <w:rFonts w:ascii="Copperplate Gothic Light" w:hAnsi="Copperplate Gothic Light"/>
+          <w:sz w:val="28"/>
+          <w:szCs w:val="28"/>
+        </w:rPr>
+        <w:t xml:space="preserve">Communicate </w:t>
+      </w:r>
+      <w:r>
+        <w:rPr>
+          <w:rFonts w:ascii="Copperplate Gothic Light" w:hAnsi="Copperplate Gothic Light"/>
+          <w:sz w:val="28"/>
+          <w:szCs w:val="28"/>
+        </w:rPr>
+        <w:t xml:space="preserve">and coordinate with both Capstone project and DSP </w:t>
+      </w:r>
+      <w:r>
+        <w:rPr>
+          <w:rFonts w:ascii="Copperplate Gothic Light" w:hAnsi="Copperplate Gothic Light"/>
+          <w:sz w:val="28"/>
+          <w:szCs w:val="28"/>
+        </w:rPr>
+        <w:t xml:space="preserve">subject coordinators and </w:t>
+      </w:r>
+      <w:r>
+        <w:rPr>
+          <w:rFonts w:ascii="Copperplate Gothic Light" w:hAnsi="Copperplate Gothic Light"/>
+          <w:sz w:val="28"/>
+          <w:szCs w:val="28"/>
+        </w:rPr>
+        <w:t>fix the timetable clash</w:t>
+      </w:r>
     </w:p>
     <w:p>
       <w:pPr>
@@ -375,7 +450,7 @@
         <w:tblLook w:val="04A0" w:firstRow="1" w:lastRow="0" w:firstColumn="1" w:lastColumn="0" w:noHBand="0" w:noVBand="1"/>
       </w:tblPr>
       <w:tblGrid>
-        <w:gridCol w:w="2538"/>
+        <w:gridCol w:w="2658"/>
         <w:gridCol w:w="3060"/>
         <w:gridCol w:w="3258"/>
       </w:tblGrid>
@@ -397,13 +472,22 @@
           <w:p>
             <w:pPr>
               <w:pStyle w:val="Heading3"/>
+              <w:spacing w:before="0" w:line="276" w:lineRule="auto"/>
               <w:rPr>
                 <w:rFonts w:eastAsia="Times"/>
+                <w:i/>
+                <w:iCs/>
+                <w:sz w:val="28"/>
+                <w:szCs w:val="28"/>
               </w:rPr>
             </w:pPr>
             <w:r>
               <w:rPr>
                 <w:rFonts w:eastAsia="Times"/>
+                <w:i/>
+                <w:iCs/>
+                <w:sz w:val="28"/>
+                <w:szCs w:val="28"/>
               </w:rPr>
               <w:t>What?</w:t>
             </w:r>
@@ -423,13 +507,22 @@
           <w:p>
             <w:pPr>
               <w:pStyle w:val="Heading3"/>
+              <w:spacing w:before="0" w:line="276" w:lineRule="auto"/>
               <w:rPr>
                 <w:rFonts w:eastAsia="Times"/>
+                <w:i/>
+                <w:iCs/>
+                <w:sz w:val="28"/>
+                <w:szCs w:val="28"/>
               </w:rPr>
             </w:pPr>
             <w:r>
               <w:rPr>
                 <w:rFonts w:eastAsia="Times"/>
+                <w:i/>
+                <w:iCs/>
+                <w:sz w:val="28"/>
+                <w:szCs w:val="28"/>
               </w:rPr>
               <w:t>Who?</w:t>
             </w:r>
@@ -449,13 +542,22 @@
           <w:p>
             <w:pPr>
               <w:pStyle w:val="Heading3"/>
+              <w:spacing w:before="0" w:line="276" w:lineRule="auto"/>
               <w:rPr>
                 <w:rFonts w:eastAsia="Times"/>
+                <w:i/>
+                <w:iCs/>
+                <w:sz w:val="28"/>
+                <w:szCs w:val="28"/>
               </w:rPr>
             </w:pPr>
             <w:r>
               <w:rPr>
                 <w:rFonts w:eastAsia="Times"/>
+                <w:i/>
+                <w:iCs/>
+                <w:sz w:val="28"/>
+                <w:szCs w:val="28"/>
               </w:rPr>
               <w:t>By when?</w:t>
             </w:r>
@@ -480,12 +582,190 @@
           <w:p>
             <w:pPr>
               <w:pStyle w:val="Heading2"/>
+              <w:numPr>
+                <w:ilvl w:val="0"/>
+                <w:numId w:val="3"/>
+              </w:numPr>
+              <w:spacing w:before="0" w:line="276" w:lineRule="auto"/>
               <w:rPr>
                 <w:rFonts w:eastAsia="Times"/>
                 <w:b/>
                 <w:i/>
-              </w:rPr>
-            </w:pPr>
+                <w:iCs/>
+                <w:szCs w:val="28"/>
+              </w:rPr>
+            </w:pPr>
+            <w:r>
+              <w:rPr>
+                <w:rFonts w:eastAsia="Times"/>
+                <w:b/>
+                <w:i/>
+                <w:iCs/>
+                <w:szCs w:val="28"/>
+              </w:rPr>
+              <w:t>Create</w:t>
+            </w:r>
+            <w:r>
+              <w:rPr>
+                <w:rFonts w:eastAsia="Times"/>
+                <w:b/>
+                <w:i/>
+                <w:iCs/>
+                <w:szCs w:val="28"/>
+              </w:rPr>
+              <w:t xml:space="preserve"> </w:t>
+            </w:r>
+            <w:r>
+              <w:rPr>
+                <w:rFonts w:eastAsia="Times"/>
+                <w:b/>
+                <w:i/>
+                <w:iCs/>
+                <w:szCs w:val="28"/>
+              </w:rPr>
+              <w:t>Github Repository</w:t>
+            </w:r>
+          </w:p>
+          <w:p>
+            <w:pPr>
+              <w:pStyle w:val="Heading2"/>
+              <w:numPr>
+                <w:ilvl w:val="0"/>
+                <w:numId w:val="3"/>
+              </w:numPr>
+              <w:spacing w:before="0" w:line="276" w:lineRule="auto"/>
+              <w:rPr>
+                <w:rFonts w:eastAsia="Times"/>
+                <w:b/>
+                <w:i/>
+                <w:iCs/>
+                <w:szCs w:val="28"/>
+              </w:rPr>
+            </w:pPr>
+            <w:r>
+              <w:rPr>
+                <w:rFonts w:eastAsia="Times"/>
+                <w:b/>
+                <w:i/>
+                <w:iCs/>
+                <w:szCs w:val="28"/>
+              </w:rPr>
+              <w:t xml:space="preserve">Create </w:t>
+            </w:r>
+            <w:r>
+              <w:rPr>
+                <w:rFonts w:eastAsia="Times"/>
+                <w:b/>
+                <w:i/>
+                <w:iCs/>
+                <w:szCs w:val="28"/>
+              </w:rPr>
+              <w:t xml:space="preserve">Slack </w:t>
+            </w:r>
+            <w:r>
+              <w:rPr>
+                <w:rFonts w:eastAsia="Times"/>
+                <w:b/>
+                <w:i/>
+                <w:iCs/>
+                <w:szCs w:val="28"/>
+              </w:rPr>
+              <w:t>Workplace</w:t>
+            </w:r>
+          </w:p>
+          <w:p>
+            <w:pPr>
+              <w:pStyle w:val="ListParagraph"/>
+              <w:numPr>
+                <w:ilvl w:val="0"/>
+                <w:numId w:val="3"/>
+              </w:numPr>
+              <w:spacing w:after="60" w:line="276" w:lineRule="auto"/>
+              <w:rPr>
+                <w:rFonts w:ascii="Copperplate Gothic Light" w:hAnsi="Copperplate Gothic Light"/>
+                <w:b/>
+                <w:i/>
+                <w:iCs/>
+                <w:sz w:val="28"/>
+                <w:szCs w:val="28"/>
+              </w:rPr>
+            </w:pPr>
+            <w:r>
+              <w:rPr>
+                <w:rFonts w:ascii="Copperplate Gothic Light" w:hAnsi="Copperplate Gothic Light"/>
+                <w:b/>
+                <w:i/>
+                <w:iCs/>
+                <w:sz w:val="28"/>
+                <w:szCs w:val="28"/>
+              </w:rPr>
+              <w:t>Group Charter</w:t>
+            </w:r>
+            <w:r>
+              <w:rPr>
+                <w:rFonts w:ascii="Copperplate Gothic Light" w:hAnsi="Copperplate Gothic Light"/>
+                <w:b/>
+                <w:i/>
+                <w:iCs/>
+                <w:sz w:val="28"/>
+                <w:szCs w:val="28"/>
+              </w:rPr>
+              <w:t xml:space="preserve"> Document</w:t>
+            </w:r>
+          </w:p>
+          <w:p>
+            <w:pPr>
+              <w:pStyle w:val="ListParagraph"/>
+              <w:numPr>
+                <w:ilvl w:val="0"/>
+                <w:numId w:val="3"/>
+              </w:numPr>
+              <w:spacing w:after="60" w:line="276" w:lineRule="auto"/>
+              <w:rPr>
+                <w:rFonts w:ascii="Copperplate Gothic Light" w:hAnsi="Copperplate Gothic Light"/>
+                <w:b/>
+                <w:i/>
+                <w:iCs/>
+                <w:sz w:val="28"/>
+                <w:szCs w:val="28"/>
+              </w:rPr>
+            </w:pPr>
+            <w:r>
+              <w:rPr>
+                <w:rFonts w:ascii="Copperplate Gothic Light" w:hAnsi="Copperplate Gothic Light"/>
+                <w:b/>
+                <w:i/>
+                <w:iCs/>
+                <w:sz w:val="28"/>
+                <w:szCs w:val="28"/>
+              </w:rPr>
+              <w:t>Meeting Record</w:t>
+            </w:r>
+          </w:p>
+          <w:p>
+            <w:pPr>
+              <w:spacing w:after="60" w:line="276" w:lineRule="auto"/>
+              <w:ind w:left="360"/>
+              <w:rPr>
+                <w:rFonts w:ascii="Copperplate Gothic Light" w:hAnsi="Copperplate Gothic Light"/>
+                <w:b/>
+                <w:i/>
+                <w:iCs/>
+                <w:sz w:val="28"/>
+                <w:szCs w:val="28"/>
+              </w:rPr>
+            </w:pPr>
+            <w:r>
+              <w:rPr>
+                <w:rFonts w:ascii="Copperplate Gothic Light" w:hAnsi="Copperplate Gothic Light"/>
+                <w:b/>
+                <w:i/>
+                <w:iCs/>
+                <w:sz w:val="28"/>
+                <w:szCs w:val="28"/>
+              </w:rPr>
+              <w:t xml:space="preserve"> </w:t>
+            </w:r>
           </w:p>
         </w:tc>
         <w:tc>
@@ -501,10 +781,221 @@
           <w:p>
             <w:pPr>
               <w:pStyle w:val="Heading2"/>
+              <w:spacing w:before="0" w:line="276" w:lineRule="auto"/>
               <w:rPr>
                 <w:rFonts w:eastAsia="Times"/>
                 <w:b/>
                 <w:i/>
+                <w:iCs/>
+                <w:szCs w:val="28"/>
+              </w:rPr>
+            </w:pPr>
+            <w:r>
+              <w:rPr>
+                <w:rFonts w:eastAsia="Times"/>
+                <w:b/>
+                <w:i/>
+                <w:iCs/>
+                <w:szCs w:val="28"/>
+              </w:rPr>
+              <w:t>Nakul</w:t>
+            </w:r>
+          </w:p>
+          <w:p>
+            <w:pPr>
+              <w:spacing w:after="60" w:line="276" w:lineRule="auto"/>
+              <w:rPr>
+                <w:rFonts w:ascii="Copperplate Gothic Light" w:hAnsi="Copperplate Gothic Light"/>
+                <w:b/>
+                <w:i/>
+                <w:iCs/>
+                <w:sz w:val="28"/>
+                <w:szCs w:val="28"/>
+              </w:rPr>
+            </w:pPr>
+          </w:p>
+          <w:p>
+            <w:pPr>
+              <w:spacing w:after="60" w:line="276" w:lineRule="auto"/>
+              <w:rPr>
+                <w:rFonts w:ascii="Copperplate Gothic Light" w:hAnsi="Copperplate Gothic Light"/>
+                <w:b/>
+                <w:i/>
+                <w:iCs/>
+                <w:sz w:val="28"/>
+                <w:szCs w:val="28"/>
+              </w:rPr>
+            </w:pPr>
+          </w:p>
+          <w:p>
+            <w:pPr>
+              <w:spacing w:after="60" w:line="276" w:lineRule="auto"/>
+              <w:rPr>
+                <w:rFonts w:ascii="Copperplate Gothic Light" w:hAnsi="Copperplate Gothic Light"/>
+                <w:b/>
+                <w:i/>
+                <w:iCs/>
+                <w:sz w:val="28"/>
+                <w:szCs w:val="28"/>
+              </w:rPr>
+            </w:pPr>
+            <w:r>
+              <w:rPr>
+                <w:rFonts w:ascii="Copperplate Gothic Light" w:hAnsi="Copperplate Gothic Light"/>
+                <w:b/>
+                <w:i/>
+                <w:iCs/>
+                <w:sz w:val="28"/>
+                <w:szCs w:val="28"/>
+              </w:rPr>
+              <w:t xml:space="preserve">Prathamesh </w:t>
+            </w:r>
+          </w:p>
+          <w:p>
+            <w:pPr>
+              <w:spacing w:after="60" w:line="276" w:lineRule="auto"/>
+              <w:rPr>
+                <w:rFonts w:ascii="Copperplate Gothic Light" w:hAnsi="Copperplate Gothic Light"/>
+                <w:b/>
+                <w:i/>
+                <w:iCs/>
+                <w:sz w:val="28"/>
+                <w:szCs w:val="28"/>
+              </w:rPr>
+            </w:pPr>
+          </w:p>
+          <w:p>
+            <w:pPr>
+              <w:spacing w:after="60" w:line="276" w:lineRule="auto"/>
+              <w:rPr>
+                <w:rFonts w:ascii="Copperplate Gothic Light" w:hAnsi="Copperplate Gothic Light"/>
+                <w:b/>
+                <w:i/>
+                <w:iCs/>
+                <w:sz w:val="28"/>
+                <w:szCs w:val="28"/>
+              </w:rPr>
+            </w:pPr>
+          </w:p>
+          <w:p>
+            <w:pPr>
+              <w:spacing w:after="60" w:line="276" w:lineRule="auto"/>
+              <w:rPr>
+                <w:rFonts w:ascii="Copperplate Gothic Light" w:hAnsi="Copperplate Gothic Light"/>
+                <w:b/>
+                <w:i/>
+                <w:iCs/>
+                <w:sz w:val="28"/>
+                <w:szCs w:val="28"/>
+              </w:rPr>
+            </w:pPr>
+            <w:r>
+              <w:rPr>
+                <w:rFonts w:ascii="Copperplate Gothic Light" w:hAnsi="Copperplate Gothic Light"/>
+                <w:b/>
+                <w:i/>
+                <w:iCs/>
+                <w:sz w:val="28"/>
+                <w:szCs w:val="28"/>
+              </w:rPr>
+              <w:t>Shreyash</w:t>
+            </w:r>
+            <w:r>
+              <w:rPr>
+                <w:rFonts w:ascii="Copperplate Gothic Light" w:hAnsi="Copperplate Gothic Light"/>
+                <w:b/>
+                <w:i/>
+                <w:iCs/>
+                <w:sz w:val="28"/>
+                <w:szCs w:val="28"/>
+              </w:rPr>
+              <w:t>, Bhavika</w:t>
+            </w:r>
+          </w:p>
+          <w:p>
+            <w:pPr>
+              <w:spacing w:after="60" w:line="276" w:lineRule="auto"/>
+              <w:rPr>
+                <w:rFonts w:ascii="Copperplate Gothic Light" w:hAnsi="Copperplate Gothic Light"/>
+                <w:b/>
+                <w:i/>
+                <w:iCs/>
+                <w:sz w:val="28"/>
+                <w:szCs w:val="28"/>
+              </w:rPr>
+            </w:pPr>
+          </w:p>
+          <w:p>
+            <w:pPr>
+              <w:spacing w:after="60" w:line="276" w:lineRule="auto"/>
+              <w:rPr>
+                <w:rFonts w:ascii="Copperplate Gothic Light" w:hAnsi="Copperplate Gothic Light"/>
+                <w:b/>
+                <w:i/>
+                <w:iCs/>
+                <w:sz w:val="28"/>
+                <w:szCs w:val="28"/>
+              </w:rPr>
+            </w:pPr>
+          </w:p>
+          <w:p>
+            <w:pPr>
+              <w:spacing w:after="60" w:line="276" w:lineRule="auto"/>
+              <w:rPr>
+                <w:rFonts w:ascii="Copperplate Gothic Light" w:hAnsi="Copperplate Gothic Light"/>
+                <w:b/>
+                <w:i/>
+                <w:iCs/>
+                <w:sz w:val="28"/>
+                <w:szCs w:val="28"/>
+              </w:rPr>
+            </w:pPr>
+            <w:r>
+              <w:rPr>
+                <w:rFonts w:ascii="Copperplate Gothic Light" w:hAnsi="Copperplate Gothic Light"/>
+                <w:b/>
+                <w:i/>
+                <w:iCs/>
+                <w:sz w:val="28"/>
+                <w:szCs w:val="28"/>
+              </w:rPr>
+              <w:t>Kushal</w:t>
+            </w:r>
+            <w:r>
+              <w:rPr>
+                <w:rFonts w:ascii="Copperplate Gothic Light" w:hAnsi="Copperplate Gothic Light"/>
+                <w:b/>
+                <w:i/>
+                <w:iCs/>
+                <w:sz w:val="28"/>
+                <w:szCs w:val="28"/>
+              </w:rPr>
+              <w:t>, Rohan</w:t>
+            </w:r>
+          </w:p>
+          <w:p>
+            <w:pPr>
+              <w:spacing w:after="60" w:line="276" w:lineRule="auto"/>
+              <w:rPr>
+                <w:rFonts w:ascii="Copperplate Gothic Light" w:hAnsi="Copperplate Gothic Light"/>
+                <w:b/>
+                <w:i/>
+                <w:iCs/>
+                <w:sz w:val="28"/>
+                <w:szCs w:val="28"/>
+              </w:rPr>
+            </w:pPr>
+          </w:p>
+          <w:p>
+            <w:pPr>
+              <w:spacing w:after="60" w:line="276" w:lineRule="auto"/>
+              <w:rPr>
+                <w:rFonts w:ascii="Copperplate Gothic Light" w:hAnsi="Copperplate Gothic Light"/>
+                <w:b/>
+                <w:i/>
+                <w:iCs/>
+                <w:sz w:val="28"/>
+                <w:szCs w:val="28"/>
               </w:rPr>
             </w:pPr>
           </w:p>
@@ -521,90 +1012,241 @@
           </w:tcPr>
           <w:p>
             <w:pPr>
-              <w:rPr>
-                <w:rFonts w:ascii="Copperplate Gothic Light" w:hAnsi="Copperplate Gothic Light"/>
-                <w:b/>
-                <w:i/>
-              </w:rPr>
-            </w:pPr>
-          </w:p>
-          <w:p>
-            <w:pPr>
-              <w:rPr>
-                <w:rFonts w:ascii="Copperplate Gothic Light" w:hAnsi="Copperplate Gothic Light"/>
-                <w:b/>
-                <w:i/>
-              </w:rPr>
-            </w:pPr>
-          </w:p>
-          <w:p>
-            <w:pPr>
-              <w:rPr>
-                <w:rFonts w:ascii="Copperplate Gothic Light" w:hAnsi="Copperplate Gothic Light"/>
-                <w:b/>
-                <w:i/>
-              </w:rPr>
-            </w:pPr>
-          </w:p>
-          <w:p>
-            <w:pPr>
-              <w:rPr>
-                <w:rFonts w:ascii="Copperplate Gothic Light" w:hAnsi="Copperplate Gothic Light"/>
-                <w:b/>
-                <w:i/>
-              </w:rPr>
-            </w:pPr>
-          </w:p>
-          <w:p>
-            <w:pPr>
-              <w:rPr>
-                <w:rFonts w:ascii="Copperplate Gothic Light" w:hAnsi="Copperplate Gothic Light"/>
-                <w:b/>
-                <w:i/>
-              </w:rPr>
-            </w:pPr>
-          </w:p>
-          <w:p>
-            <w:pPr>
-              <w:rPr>
-                <w:rFonts w:ascii="Copperplate Gothic Light" w:hAnsi="Copperplate Gothic Light"/>
-                <w:b/>
-                <w:i/>
-              </w:rPr>
-            </w:pPr>
-          </w:p>
-          <w:p>
-            <w:pPr>
-              <w:rPr>
-                <w:rFonts w:ascii="Copperplate Gothic Light" w:hAnsi="Copperplate Gothic Light"/>
-                <w:b/>
-                <w:i/>
-              </w:rPr>
-            </w:pPr>
-          </w:p>
-          <w:p>
-            <w:pPr>
-              <w:rPr>
-                <w:rFonts w:ascii="Copperplate Gothic Light" w:hAnsi="Copperplate Gothic Light"/>
-                <w:b/>
-                <w:i/>
-              </w:rPr>
-            </w:pPr>
-          </w:p>
-          <w:p>
-            <w:pPr>
-              <w:rPr>
-                <w:rFonts w:ascii="Copperplate Gothic Light" w:hAnsi="Copperplate Gothic Light"/>
-                <w:b/>
-                <w:i/>
-              </w:rPr>
-            </w:pPr>
-          </w:p>
-          <w:p/>
-          <w:p/>
-          <w:p/>
-          <w:p/>
-          <w:p/>
+              <w:spacing w:after="60" w:line="276" w:lineRule="auto"/>
+              <w:rPr>
+                <w:rFonts w:ascii="Copperplate Gothic Light" w:hAnsi="Copperplate Gothic Light"/>
+                <w:b/>
+                <w:i/>
+                <w:iCs/>
+                <w:sz w:val="28"/>
+                <w:szCs w:val="28"/>
+              </w:rPr>
+            </w:pPr>
+          </w:p>
+          <w:p>
+            <w:pPr>
+              <w:spacing w:after="60" w:line="276" w:lineRule="auto"/>
+              <w:rPr>
+                <w:rFonts w:ascii="Copperplate Gothic Light" w:hAnsi="Copperplate Gothic Light"/>
+                <w:b/>
+                <w:i/>
+                <w:iCs/>
+                <w:sz w:val="28"/>
+                <w:szCs w:val="28"/>
+              </w:rPr>
+            </w:pPr>
+            <w:r>
+              <w:rPr>
+                <w:rFonts w:ascii="Copperplate Gothic Light" w:hAnsi="Copperplate Gothic Light"/>
+                <w:b/>
+                <w:i/>
+                <w:iCs/>
+                <w:sz w:val="28"/>
+                <w:szCs w:val="28"/>
+              </w:rPr>
+              <w:t>08/08/2026</w:t>
+            </w:r>
+          </w:p>
+          <w:p>
+            <w:pPr>
+              <w:spacing w:after="60" w:line="276" w:lineRule="auto"/>
+              <w:rPr>
+                <w:rFonts w:ascii="Copperplate Gothic Light" w:hAnsi="Copperplate Gothic Light"/>
+                <w:b/>
+                <w:i/>
+                <w:iCs/>
+                <w:sz w:val="28"/>
+                <w:szCs w:val="28"/>
+              </w:rPr>
+            </w:pPr>
+          </w:p>
+          <w:p>
+            <w:pPr>
+              <w:spacing w:after="60" w:line="276" w:lineRule="auto"/>
+              <w:rPr>
+                <w:rFonts w:ascii="Copperplate Gothic Light" w:hAnsi="Copperplate Gothic Light"/>
+                <w:b/>
+                <w:i/>
+                <w:iCs/>
+                <w:sz w:val="28"/>
+                <w:szCs w:val="28"/>
+              </w:rPr>
+            </w:pPr>
+          </w:p>
+          <w:p>
+            <w:pPr>
+              <w:spacing w:after="60" w:line="276" w:lineRule="auto"/>
+              <w:rPr>
+                <w:rFonts w:ascii="Copperplate Gothic Light" w:hAnsi="Copperplate Gothic Light"/>
+                <w:b/>
+                <w:i/>
+                <w:iCs/>
+                <w:sz w:val="28"/>
+                <w:szCs w:val="28"/>
+              </w:rPr>
+            </w:pPr>
+            <w:r>
+              <w:rPr>
+                <w:rFonts w:ascii="Copperplate Gothic Light" w:hAnsi="Copperplate Gothic Light"/>
+                <w:b/>
+                <w:i/>
+                <w:iCs/>
+                <w:sz w:val="28"/>
+                <w:szCs w:val="28"/>
+              </w:rPr>
+              <w:t>06/08/2026</w:t>
+            </w:r>
+          </w:p>
+          <w:p>
+            <w:pPr>
+              <w:spacing w:after="60" w:line="276" w:lineRule="auto"/>
+              <w:rPr>
+                <w:rFonts w:ascii="Copperplate Gothic Light" w:hAnsi="Copperplate Gothic Light"/>
+                <w:b/>
+                <w:i/>
+                <w:iCs/>
+                <w:sz w:val="28"/>
+                <w:szCs w:val="28"/>
+              </w:rPr>
+            </w:pPr>
+          </w:p>
+          <w:p>
+            <w:pPr>
+              <w:spacing w:after="60" w:line="276" w:lineRule="auto"/>
+              <w:rPr>
+                <w:rFonts w:ascii="Copperplate Gothic Light" w:hAnsi="Copperplate Gothic Light"/>
+                <w:b/>
+                <w:i/>
+                <w:iCs/>
+                <w:sz w:val="28"/>
+                <w:szCs w:val="28"/>
+              </w:rPr>
+            </w:pPr>
+          </w:p>
+          <w:p>
+            <w:pPr>
+              <w:spacing w:after="60" w:line="276" w:lineRule="auto"/>
+              <w:rPr>
+                <w:rFonts w:ascii="Copperplate Gothic Light" w:hAnsi="Copperplate Gothic Light"/>
+                <w:b/>
+                <w:i/>
+                <w:iCs/>
+                <w:sz w:val="28"/>
+                <w:szCs w:val="28"/>
+              </w:rPr>
+            </w:pPr>
+            <w:r>
+              <w:rPr>
+                <w:rFonts w:ascii="Copperplate Gothic Light" w:hAnsi="Copperplate Gothic Light"/>
+                <w:b/>
+                <w:i/>
+                <w:iCs/>
+                <w:sz w:val="28"/>
+                <w:szCs w:val="28"/>
+              </w:rPr>
+              <w:t>08/08/2026</w:t>
+            </w:r>
+          </w:p>
+          <w:p>
+            <w:pPr>
+              <w:spacing w:after="60" w:line="276" w:lineRule="auto"/>
+              <w:rPr>
+                <w:rFonts w:ascii="Copperplate Gothic Light" w:hAnsi="Copperplate Gothic Light"/>
+                <w:b/>
+                <w:i/>
+                <w:iCs/>
+                <w:sz w:val="28"/>
+                <w:szCs w:val="28"/>
+              </w:rPr>
+            </w:pPr>
+          </w:p>
+          <w:p>
+            <w:pPr>
+              <w:spacing w:after="60" w:line="276" w:lineRule="auto"/>
+              <w:rPr>
+                <w:rFonts w:ascii="Copperplate Gothic Light" w:hAnsi="Copperplate Gothic Light"/>
+                <w:b/>
+                <w:i/>
+                <w:iCs/>
+                <w:sz w:val="28"/>
+                <w:szCs w:val="28"/>
+              </w:rPr>
+            </w:pPr>
+          </w:p>
+          <w:p>
+            <w:pPr>
+              <w:spacing w:after="60" w:line="276" w:lineRule="auto"/>
+              <w:rPr>
+                <w:rFonts w:ascii="Copperplate Gothic Light" w:hAnsi="Copperplate Gothic Light"/>
+                <w:b/>
+                <w:i/>
+                <w:iCs/>
+                <w:sz w:val="28"/>
+                <w:szCs w:val="28"/>
+              </w:rPr>
+            </w:pPr>
+            <w:r>
+              <w:rPr>
+                <w:rFonts w:ascii="Copperplate Gothic Light" w:hAnsi="Copperplate Gothic Light"/>
+                <w:b/>
+                <w:i/>
+                <w:iCs/>
+                <w:sz w:val="28"/>
+                <w:szCs w:val="28"/>
+              </w:rPr>
+              <w:t>08/08/202</w:t>
+            </w:r>
+            <w:r>
+              <w:rPr>
+                <w:rFonts w:ascii="Copperplate Gothic Light" w:hAnsi="Copperplate Gothic Light"/>
+                <w:b/>
+                <w:i/>
+                <w:iCs/>
+                <w:sz w:val="28"/>
+                <w:szCs w:val="28"/>
+              </w:rPr>
+              <w:t>6</w:t>
+            </w:r>
+          </w:p>
+          <w:p>
+            <w:pPr>
+              <w:spacing w:after="60" w:line="276" w:lineRule="auto"/>
+              <w:rPr>
+                <w:rFonts w:ascii="Copperplate Gothic Light" w:hAnsi="Copperplate Gothic Light"/>
+                <w:b/>
+                <w:i/>
+                <w:iCs/>
+                <w:sz w:val="28"/>
+                <w:szCs w:val="28"/>
+              </w:rPr>
+            </w:pPr>
+          </w:p>
+          <w:p>
+            <w:pPr>
+              <w:spacing w:after="60" w:line="276" w:lineRule="auto"/>
+              <w:rPr>
+                <w:rFonts w:ascii="Copperplate Gothic Light" w:hAnsi="Copperplate Gothic Light"/>
+                <w:b/>
+                <w:i/>
+                <w:iCs/>
+                <w:sz w:val="28"/>
+                <w:szCs w:val="28"/>
+              </w:rPr>
+            </w:pPr>
+          </w:p>
+          <w:p>
+            <w:pPr>
+              <w:spacing w:after="60" w:line="276" w:lineRule="auto"/>
+              <w:rPr>
+                <w:rFonts w:ascii="Copperplate Gothic Light" w:hAnsi="Copperplate Gothic Light"/>
+                <w:b/>
+                <w:i/>
+                <w:iCs/>
+                <w:sz w:val="28"/>
+                <w:szCs w:val="28"/>
+              </w:rPr>
+            </w:pPr>
+          </w:p>
         </w:tc>
       </w:tr>
     </w:tbl>
@@ -617,6 +1259,305 @@
     </w:sectPr>
   </w:body>
 </w:document>
+</file>
+
+<file path=word/numbering.xml><?xml version="1.0" encoding="utf-8"?>
+<w:numbering xmlns:wpc="http://schemas.microsoft.com/office/word/2010/wordprocessingCanvas" xmlns:cx="http://schemas.microsoft.com/office/drawing/2014/chartex" xmlns:cx1="http://schemas.microsoft.com/office/drawing/2015/9/8/chartex" xmlns:cx2="http://schemas.microsoft.com/office/drawing/2015/10/21/chartex" xmlns:cx3="http://schemas.microsoft.com/office/drawing/2016/5/9/chartex" xmlns:cx4="http://schemas.microsoft.com/office/drawing/2016/5/10/chartex" xmlns:cx5="http://schemas.microsoft.com/office/drawing/2016/5/11/chartex" xmlns:cx6="http://schemas.microsoft.com/office/drawing/2016/5/12/chartex" xmlns:cx7="http://schemas.microsoft.com/office/drawing/2016/5/13/chartex" xmlns:cx8="http://schemas.microsoft.com/office/drawing/2016/5/14/chartex" xmlns:mc="http://schemas.openxmlformats.org/markup-compatibility/2006" xmlns:aink="http://schemas.microsoft.com/office/drawing/2016/ink" xmlns:am3d="http://schemas.microsoft.com/office/drawing/2017/model3d" xmlns:o="urn:schemas-microsoft-com:office:office" xmlns:oel="http://schemas.microsoft.com/office/2019/extlst" xmlns:r="http://schemas.openxmlformats.org/officeDocument/2006/relationships" xmlns:m="http://schemas.openxmlformats.org/officeDocument/2006/math" xmlns:v="urn:schemas-microsoft-com:vml" xmlns:wp14="http://schemas.microsoft.com/office/word/2010/wordprocessingDrawing" xmlns:wp="http://schemas.openxmlformats.org/drawingml/2006/wordprocessingDrawing" xmlns:w10="urn:schemas-microsoft-com:office:word" xmlns:w="http://schemas.openxmlformats.org/wordprocessingml/2006/main" xmlns:w14="http://schemas.microsoft.com/office/word/2010/wordml" xmlns:w15="http://schemas.microsoft.com/office/word/2012/wordml" xmlns:w16cei="http://schemas.microsoft.com/office/word/2026/wordml/cei" xmlns:w16cex="http://schemas.microsoft.com/office/word/2018/wordml/cex" xmlns:w16cid="http://schemas.microsoft.com/office/word/2016/wordml/cid" xmlns:w16="http://schemas.microsoft.com/office/word/2018/wordml" xmlns:w16du="http://schemas.microsoft.com/office/word/2023/wordml/word16du" xmlns:w16sdtdh="http://schemas.microsoft.com/office/word/2020/wordml/sdtdatahash" xmlns:w16sdtfl="http://schemas.microsoft.com/office/word/2024/wordml/sdtformatlock" xmlns:w16se="http://schemas.microsoft.com/office/word/2015/wordml/symex" xmlns:wpg="http://schemas.microsoft.com/office/word/2010/wordprocessingGroup" xmlns:wpi="http://schemas.microsoft.com/office/word/2010/wordprocessingInk" xmlns:wne="http://schemas.microsoft.com/office/word/2006/wordml" xmlns:wps="http://schemas.microsoft.com/office/word/2010/wordprocessingShape" mc:Ignorable="w14 w15 w16se w16cid w16 w16cex w16sdtdh w16sdtfl w16du wp14">
+  <w:abstractNum w:abstractNumId="0" w15:restartNumberingAfterBreak="0">
+    <w:nsid w:val="1F5D7664"/>
+    <w:multiLevelType w:val="hybridMultilevel"/>
+    <w:tmpl w:val="32125D74"/>
+    <w:lvl w:ilvl="0" w:tplc="04090001">
+      <w:start w:val="1"/>
+      <w:numFmt w:val="bullet"/>
+      <w:lvlText w:val=""/>
+      <w:lvlJc w:val="left"/>
+      <w:pPr>
+        <w:ind w:left="720" w:hanging="360"/>
+      </w:pPr>
+      <w:rPr>
+        <w:rFonts w:ascii="Symbol" w:hAnsi="Symbol" w:hint="default"/>
+      </w:rPr>
+    </w:lvl>
+    <w:lvl w:ilvl="1" w:tplc="04090003" w:tentative="1">
+      <w:start w:val="1"/>
+      <w:numFmt w:val="bullet"/>
+      <w:lvlText w:val="o"/>
+      <w:lvlJc w:val="left"/>
+      <w:pPr>
+        <w:ind w:left="1440" w:hanging="360"/>
+      </w:pPr>
+      <w:rPr>
+        <w:rFonts w:ascii="Courier New" w:hAnsi="Courier New" w:cs="Courier New" w:hint="default"/>
+      </w:rPr>
+    </w:lvl>
+    <w:lvl w:ilvl="2" w:tplc="04090005" w:tentative="1">
+      <w:start w:val="1"/>
+      <w:numFmt w:val="bullet"/>
+      <w:lvlText w:val=""/>
+      <w:lvlJc w:val="left"/>
+      <w:pPr>
+        <w:ind w:left="2160" w:hanging="360"/>
+      </w:pPr>
+      <w:rPr>
+        <w:rFonts w:ascii="Wingdings" w:hAnsi="Wingdings" w:hint="default"/>
+      </w:rPr>
+    </w:lvl>
+    <w:lvl w:ilvl="3" w:tplc="04090001" w:tentative="1">
+      <w:start w:val="1"/>
+      <w:numFmt w:val="bullet"/>
+      <w:lvlText w:val=""/>
+      <w:lvlJc w:val="left"/>
+      <w:pPr>
+        <w:ind w:left="2880" w:hanging="360"/>
+      </w:pPr>
+      <w:rPr>
+        <w:rFonts w:ascii="Symbol" w:hAnsi="Symbol" w:hint="default"/>
+      </w:rPr>
+    </w:lvl>
+    <w:lvl w:ilvl="4" w:tplc="04090003" w:tentative="1">
+      <w:start w:val="1"/>
+      <w:numFmt w:val="bullet"/>
+      <w:lvlText w:val="o"/>
+      <w:lvlJc w:val="left"/>
+      <w:pPr>
+        <w:ind w:left="3600" w:hanging="360"/>
+      </w:pPr>
+      <w:rPr>
+        <w:rFonts w:ascii="Courier New" w:hAnsi="Courier New" w:cs="Courier New" w:hint="default"/>
+      </w:rPr>
+    </w:lvl>
+    <w:lvl w:ilvl="5" w:tplc="04090005" w:tentative="1">
+      <w:start w:val="1"/>
+      <w:numFmt w:val="bullet"/>
+      <w:lvlText w:val=""/>
+      <w:lvlJc w:val="left"/>
+      <w:pPr>
+        <w:ind w:left="4320" w:hanging="360"/>
+      </w:pPr>
+      <w:rPr>
+        <w:rFonts w:ascii="Wingdings" w:hAnsi="Wingdings" w:hint="default"/>
+      </w:rPr>
+    </w:lvl>
+    <w:lvl w:ilvl="6" w:tplc="04090001" w:tentative="1">
+      <w:start w:val="1"/>
+      <w:numFmt w:val="bullet"/>
+      <w:lvlText w:val=""/>
+      <w:lvlJc w:val="left"/>
+      <w:pPr>
+        <w:ind w:left="5040" w:hanging="360"/>
+      </w:pPr>
+      <w:rPr>
+        <w:rFonts w:ascii="Symbol" w:hAnsi="Symbol" w:hint="default"/>
+      </w:rPr>
+    </w:lvl>
+    <w:lvl w:ilvl="7" w:tplc="04090003" w:tentative="1">
+      <w:start w:val="1"/>
+      <w:numFmt w:val="bullet"/>
+      <w:lvlText w:val="o"/>
+      <w:lvlJc w:val="left"/>
+      <w:pPr>
+        <w:ind w:left="5760" w:hanging="360"/>
+      </w:pPr>
+      <w:rPr>
+        <w:rFonts w:ascii="Courier New" w:hAnsi="Courier New" w:cs="Courier New" w:hint="default"/>
+      </w:rPr>
+    </w:lvl>
+    <w:lvl w:ilvl="8" w:tplc="04090005" w:tentative="1">
+      <w:start w:val="1"/>
+      <w:numFmt w:val="bullet"/>
+      <w:lvlText w:val=""/>
+      <w:lvlJc w:val="left"/>
+      <w:pPr>
+        <w:ind w:left="6480" w:hanging="360"/>
+      </w:pPr>
+      <w:rPr>
+        <w:rFonts w:ascii="Wingdings" w:hAnsi="Wingdings" w:hint="default"/>
+      </w:rPr>
+    </w:lvl>
+  </w:abstractNum>
+  <w:abstractNum w:abstractNumId="1" w15:restartNumberingAfterBreak="0">
+    <w:nsid w:val="294F0135"/>
+    <w:multiLevelType w:val="hybridMultilevel"/>
+    <w:tmpl w:val="93CA439C"/>
+    <w:lvl w:ilvl="0" w:tplc="0409000F">
+      <w:start w:val="1"/>
+      <w:numFmt w:val="decimal"/>
+      <w:lvlText w:val="%1."/>
+      <w:lvlJc w:val="left"/>
+      <w:pPr>
+        <w:ind w:left="720" w:hanging="360"/>
+      </w:pPr>
+    </w:lvl>
+    <w:lvl w:ilvl="1" w:tplc="04090019" w:tentative="1">
+      <w:start w:val="1"/>
+      <w:numFmt w:val="lowerLetter"/>
+      <w:lvlText w:val="%2."/>
+      <w:lvlJc w:val="left"/>
+      <w:pPr>
+        <w:ind w:left="1440" w:hanging="360"/>
+      </w:pPr>
+    </w:lvl>
+    <w:lvl w:ilvl="2" w:tplc="0409001B" w:tentative="1">
+      <w:start w:val="1"/>
+      <w:numFmt w:val="lowerRoman"/>
+      <w:lvlText w:val="%3."/>
+      <w:lvlJc w:val="right"/>
+      <w:pPr>
+        <w:ind w:left="2160" w:hanging="180"/>
+      </w:pPr>
+    </w:lvl>
+    <w:lvl w:ilvl="3" w:tplc="0409000F" w:tentative="1">
+      <w:start w:val="1"/>
+      <w:numFmt w:val="decimal"/>
+      <w:lvlText w:val="%4."/>
+      <w:lvlJc w:val="left"/>
+      <w:pPr>
+        <w:ind w:left="2880" w:hanging="360"/>
+      </w:pPr>
+    </w:lvl>
+    <w:lvl w:ilvl="4" w:tplc="04090019" w:tentative="1">
+      <w:start w:val="1"/>
+      <w:numFmt w:val="lowerLetter"/>
+      <w:lvlText w:val="%5."/>
+      <w:lvlJc w:val="left"/>
+      <w:pPr>
+        <w:ind w:left="3600" w:hanging="360"/>
+      </w:pPr>
+    </w:lvl>
+    <w:lvl w:ilvl="5" w:tplc="0409001B" w:tentative="1">
+      <w:start w:val="1"/>
+      <w:numFmt w:val="lowerRoman"/>
+      <w:lvlText w:val="%6."/>
+      <w:lvlJc w:val="right"/>
+      <w:pPr>
+        <w:ind w:left="4320" w:hanging="180"/>
+      </w:pPr>
+    </w:lvl>
+    <w:lvl w:ilvl="6" w:tplc="0409000F" w:tentative="1">
+      <w:start w:val="1"/>
+      <w:numFmt w:val="decimal"/>
+      <w:lvlText w:val="%7."/>
+      <w:lvlJc w:val="left"/>
+      <w:pPr>
+        <w:ind w:left="5040" w:hanging="360"/>
+      </w:pPr>
+    </w:lvl>
+    <w:lvl w:ilvl="7" w:tplc="04090019" w:tentative="1">
+      <w:start w:val="1"/>
+      <w:numFmt w:val="lowerLetter"/>
+      <w:lvlText w:val="%8."/>
+      <w:lvlJc w:val="left"/>
+      <w:pPr>
+        <w:ind w:left="5760" w:hanging="360"/>
+      </w:pPr>
+    </w:lvl>
+    <w:lvl w:ilvl="8" w:tplc="0409001B" w:tentative="1">
+      <w:start w:val="1"/>
+      <w:numFmt w:val="lowerRoman"/>
+      <w:lvlText w:val="%9."/>
+      <w:lvlJc w:val="right"/>
+      <w:pPr>
+        <w:ind w:left="6480" w:hanging="180"/>
+      </w:pPr>
+    </w:lvl>
+  </w:abstractNum>
+  <w:abstractNum w:abstractNumId="2" w15:restartNumberingAfterBreak="0">
+    <w:nsid w:val="3FD22D22"/>
+    <w:multiLevelType w:val="hybridMultilevel"/>
+    <w:tmpl w:val="AD38CE90"/>
+    <w:lvl w:ilvl="0" w:tplc="0409000F">
+      <w:start w:val="1"/>
+      <w:numFmt w:val="decimal"/>
+      <w:lvlText w:val="%1."/>
+      <w:lvlJc w:val="left"/>
+      <w:pPr>
+        <w:ind w:left="720" w:hanging="360"/>
+      </w:pPr>
+    </w:lvl>
+    <w:lvl w:ilvl="1" w:tplc="04090019" w:tentative="1">
+      <w:start w:val="1"/>
+      <w:numFmt w:val="lowerLetter"/>
+      <w:lvlText w:val="%2."/>
+      <w:lvlJc w:val="left"/>
+      <w:pPr>
+        <w:ind w:left="1440" w:hanging="360"/>
+      </w:pPr>
+    </w:lvl>
+    <w:lvl w:ilvl="2" w:tplc="0409001B" w:tentative="1">
+      <w:start w:val="1"/>
+      <w:numFmt w:val="lowerRoman"/>
+      <w:lvlText w:val="%3."/>
+      <w:lvlJc w:val="right"/>
+      <w:pPr>
+        <w:ind w:left="2160" w:hanging="180"/>
+      </w:pPr>
+    </w:lvl>
+    <w:lvl w:ilvl="3" w:tplc="0409000F" w:tentative="1">
+      <w:start w:val="1"/>
+      <w:numFmt w:val="decimal"/>
+      <w:lvlText w:val="%4."/>
+      <w:lvlJc w:val="left"/>
+      <w:pPr>
+        <w:ind w:left="2880" w:hanging="360"/>
+      </w:pPr>
+    </w:lvl>
+    <w:lvl w:ilvl="4" w:tplc="04090019" w:tentative="1">
+      <w:start w:val="1"/>
+      <w:numFmt w:val="lowerLetter"/>
+      <w:lvlText w:val="%5."/>
+      <w:lvlJc w:val="left"/>
+      <w:pPr>
+        <w:ind w:left="3600" w:hanging="360"/>
+      </w:pPr>
+    </w:lvl>
+    <w:lvl w:ilvl="5" w:tplc="0409001B" w:tentative="1">
+      <w:start w:val="1"/>
+      <w:numFmt w:val="lowerRoman"/>
+      <w:lvlText w:val="%6."/>
+      <w:lvlJc w:val="right"/>
+      <w:pPr>
+        <w:ind w:left="4320" w:hanging="180"/>
+      </w:pPr>
+    </w:lvl>
+    <w:lvl w:ilvl="6" w:tplc="0409000F" w:tentative="1">
+      <w:start w:val="1"/>
+      <w:numFmt w:val="decimal"/>
+      <w:lvlText w:val="%7."/>
+      <w:lvlJc w:val="left"/>
+      <w:pPr>
+        <w:ind w:left="5040" w:hanging="360"/>
+      </w:pPr>
+    </w:lvl>
+    <w:lvl w:ilvl="7" w:tplc="04090019" w:tentative="1">
+      <w:start w:val="1"/>
+      <w:numFmt w:val="lowerLetter"/>
+      <w:lvlText w:val="%8."/>
+      <w:lvlJc w:val="left"/>
+      <w:pPr>
+        <w:ind w:left="5760" w:hanging="360"/>
+      </w:pPr>
+    </w:lvl>
+    <w:lvl w:ilvl="8" w:tplc="0409001B" w:tentative="1">
+      <w:start w:val="1"/>
+      <w:numFmt w:val="lowerRoman"/>
+      <w:lvlText w:val="%9."/>
+      <w:lvlJc w:val="right"/>
+      <w:pPr>
+        <w:ind w:left="6480" w:hanging="180"/>
+      </w:pPr>
+    </w:lvl>
+  </w:abstractNum>
+  <w:num w:numId="1" w16cid:durableId="209461351">
+    <w:abstractNumId w:val="2"/>
+  </w:num>
+  <w:num w:numId="2" w16cid:durableId="1288202060">
+    <w:abstractNumId w:val="0"/>
+  </w:num>
+  <w:num w:numId="3" w16cid:durableId="1363286952">
+    <w:abstractNumId w:val="1"/>
+  </w:num>
+</w:numbering>
 </file>
 
 <file path=word/styles.xml><?xml version="1.0" encoding="utf-8"?>
@@ -1052,7 +1993,6 @@
     <w:basedOn w:val="Normal"/>
     <w:next w:val="Normal"/>
     <w:link w:val="Heading2Char"/>
-    <w:semiHidden/>
     <w:unhideWhenUsed/>
     <w:qFormat/>
     <w:rsid w:val="00AF1BE7"/>
@@ -1155,7 +2095,6 @@
     <w:name w:val="Heading 2 Char"/>
     <w:basedOn w:val="DefaultParagraphFont"/>
     <w:link w:val="Heading2"/>
-    <w:semiHidden/>
     <w:rsid w:val="00AF1BE7"/>
     <w:rPr>
       <w:rFonts w:ascii="Copperplate Gothic Light" w:eastAsia="Times New Roman" w:hAnsi="Copperplate Gothic Light" w:cs="Times New Roman"/>
@@ -1190,6 +2129,17 @@
       <w:szCs w:val="20"/>
       <w:lang w:eastAsia="en-AU"/>
     </w:rPr>
+  </w:style>
+  <w:style w:type="paragraph" w:styleId="ListParagraph">
+    <w:name w:val="List Paragraph"/>
+    <w:basedOn w:val="Normal"/>
+    <w:uiPriority w:val="34"/>
+    <w:qFormat/>
+    <w:rsid w:val="00421A91"/>
+    <w:pPr>
+      <w:ind w:left="720"/>
+      <w:contextualSpacing/>
+    </w:pPr>
   </w:style>
 </w:styles>
 </file>

</xml_diff>